<commit_message>
Se agrega Word con cosas necesarias para Salus IV
</commit_message>
<xml_diff>
--- a/Salus III/PCB/Cosas para Salus III.docx
+++ b/Salus III/PCB/Cosas para Salus III.docx
@@ -88,11 +88,13 @@
           <w:numId w:val="2"/>
         </w:numPr>
         <w:rPr>
-          <w:lang w:val="es-ES"/>
-        </w:rPr>
-      </w:pPr>
-      <w:r>
-        <w:rPr>
+          <w:highlight w:val="yellow"/>
+          <w:lang w:val="es-ES"/>
+        </w:rPr>
+      </w:pPr>
+      <w:r>
+        <w:rPr>
+          <w:highlight w:val="yellow"/>
           <w:lang w:val="es-ES"/>
         </w:rPr>
         <w:t xml:space="preserve">Circuito seguridad entrada para cada step de 24V. Protección sobre tensión, </w:t>
@@ -100,6 +102,7 @@
       <w:proofErr w:type="spellStart"/>
       <w:r>
         <w:rPr>
+          <w:highlight w:val="yellow"/>
           <w:lang w:val="es-ES"/>
         </w:rPr>
         <w:t>sobrecorriente</w:t>
@@ -107,6 +110,7 @@
       <w:proofErr w:type="spellEnd"/>
       <w:r>
         <w:rPr>
+          <w:highlight w:val="yellow"/>
           <w:lang w:val="es-ES"/>
         </w:rPr>
         <w:t xml:space="preserve"> y temperatura. En lo posible con BJT o </w:t>
@@ -114,6 +118,7 @@
       <w:proofErr w:type="spellStart"/>
       <w:r>
         <w:rPr>
+          <w:highlight w:val="yellow"/>
           <w:lang w:val="es-ES"/>
         </w:rPr>
         <w:t>Mosfet</w:t>
@@ -121,6 +126,7 @@
       <w:proofErr w:type="spellEnd"/>
       <w:r>
         <w:rPr>
+          <w:highlight w:val="yellow"/>
           <w:lang w:val="es-ES"/>
         </w:rPr>
         <w:t>.</w:t>
@@ -134,23 +140,27 @@
           <w:numId w:val="2"/>
         </w:numPr>
         <w:rPr>
-          <w:lang w:val="es-ES"/>
-        </w:rPr>
-      </w:pPr>
-      <w:r>
-        <w:rPr>
+          <w:highlight w:val="yellow"/>
+          <w:lang w:val="es-ES"/>
+        </w:rPr>
+      </w:pPr>
+      <w:r>
+        <w:rPr>
+          <w:highlight w:val="yellow"/>
           <w:lang w:val="es-ES"/>
         </w:rPr>
         <w:t xml:space="preserve">Circuito seguridad salida 5V y 7V. </w:t>
       </w:r>
       <w:r>
         <w:rPr>
+          <w:highlight w:val="yellow"/>
           <w:lang w:val="es-ES"/>
         </w:rPr>
         <w:t>Protección</w:t>
       </w:r>
       <w:r>
         <w:rPr>
+          <w:highlight w:val="yellow"/>
           <w:lang w:val="es-ES"/>
         </w:rPr>
         <w:t xml:space="preserve"> sobretensión, </w:t>
@@ -158,6 +168,7 @@
       <w:proofErr w:type="spellStart"/>
       <w:r>
         <w:rPr>
+          <w:highlight w:val="yellow"/>
           <w:lang w:val="es-ES"/>
         </w:rPr>
         <w:t>sobrecorriente</w:t>
@@ -165,6 +176,7 @@
       <w:proofErr w:type="spellEnd"/>
       <w:r>
         <w:rPr>
+          <w:highlight w:val="yellow"/>
           <w:lang w:val="es-ES"/>
         </w:rPr>
         <w:t xml:space="preserve"> y temperatura. Intentar que sea con transistores de otra forma con relé como este hecho.</w:t>
@@ -178,11 +190,13 @@
           <w:numId w:val="2"/>
         </w:numPr>
         <w:rPr>
-          <w:lang w:val="es-ES"/>
-        </w:rPr>
-      </w:pPr>
-      <w:r>
-        <w:rPr>
+          <w:highlight w:val="yellow"/>
+          <w:lang w:val="es-ES"/>
+        </w:rPr>
+      </w:pPr>
+      <w:r>
+        <w:rPr>
+          <w:highlight w:val="yellow"/>
           <w:lang w:val="es-ES"/>
         </w:rPr>
         <w:t>Agregar pines de (Iˆ</w:t>
@@ -190,6 +204,7 @@
       <w:proofErr w:type="gramStart"/>
       <w:r>
         <w:rPr>
+          <w:highlight w:val="yellow"/>
           <w:lang w:val="es-ES"/>
         </w:rPr>
         <w:t>2)C</w:t>
@@ -197,18 +212,21 @@
       <w:proofErr w:type="gramEnd"/>
       <w:r>
         <w:rPr>
+          <w:highlight w:val="yellow"/>
           <w:lang w:val="es-ES"/>
         </w:rPr>
         <w:t xml:space="preserve"> </w:t>
       </w:r>
       <w:r>
         <w:rPr>
+          <w:highlight w:val="yellow"/>
           <w:lang w:val="es-ES"/>
         </w:rPr>
         <w:t xml:space="preserve"> (GPIO 35 y 34).</w:t>
       </w:r>
       <w:r>
         <w:rPr>
+          <w:highlight w:val="yellow"/>
           <w:lang w:val="es-ES"/>
         </w:rPr>
         <w:t xml:space="preserve"> </w:t>
@@ -222,11 +240,13 @@
           <w:numId w:val="2"/>
         </w:numPr>
         <w:rPr>
-          <w:lang w:val="es-ES"/>
-        </w:rPr>
-      </w:pPr>
-      <w:r>
-        <w:rPr>
+          <w:highlight w:val="yellow"/>
+          <w:lang w:val="es-ES"/>
+        </w:rPr>
+      </w:pPr>
+      <w:r>
+        <w:rPr>
+          <w:highlight w:val="yellow"/>
           <w:lang w:val="es-ES"/>
         </w:rPr>
         <w:t xml:space="preserve">Agregar espacio para la tira de pines de </w:t>
@@ -234,6 +254,7 @@
       <w:proofErr w:type="spellStart"/>
       <w:r>
         <w:rPr>
+          <w:highlight w:val="yellow"/>
           <w:lang w:val="es-ES"/>
         </w:rPr>
         <w:t>Rasperry</w:t>
@@ -613,7 +634,7 @@
           <w:noProof/>
         </w:rPr>
         <w:drawing>
-          <wp:inline distT="0" distB="0" distL="0" distR="0" wp14:anchorId="741FA079" wp14:editId="3E2D6315">
+          <wp:inline distT="0" distB="0" distL="0" distR="0" wp14:anchorId="741FA079" wp14:editId="2DE41FCF">
             <wp:extent cx="5400040" cy="3035935"/>
             <wp:effectExtent l="0" t="0" r="0" b="0"/>
             <wp:docPr id="942170011" name="Imagen 1"/>

</xml_diff>

<commit_message>
Se completo la investigacion y se agregaron simulaciones de Circuitos de proteccion
</commit_message>
<xml_diff>
--- a/Salus III/PCB/Cosas para Salus III.docx
+++ b/Salus III/PCB/Cosas para Salus III.docx
@@ -2,6 +2,16 @@
 <file path=word/document.xml><?xml version="1.0" encoding="utf-8"?>
 <w:document xmlns:wpc="http://schemas.microsoft.com/office/word/2010/wordprocessingCanvas" xmlns:cx="http://schemas.microsoft.com/office/drawing/2014/chartex" xmlns:cx1="http://schemas.microsoft.com/office/drawing/2015/9/8/chartex" xmlns:cx2="http://schemas.microsoft.com/office/drawing/2015/10/21/chartex" xmlns:cx3="http://schemas.microsoft.com/office/drawing/2016/5/9/chartex" xmlns:cx4="http://schemas.microsoft.com/office/drawing/2016/5/10/chartex" xmlns:cx5="http://schemas.microsoft.com/office/drawing/2016/5/11/chartex" xmlns:cx6="http://schemas.microsoft.com/office/drawing/2016/5/12/chartex" xmlns:cx7="http://schemas.microsoft.com/office/drawing/2016/5/13/chartex" xmlns:cx8="http://schemas.microsoft.com/office/drawing/2016/5/14/chartex" xmlns:mc="http://schemas.openxmlformats.org/markup-compatibility/2006" xmlns:aink="http://schemas.microsoft.com/office/drawing/2016/ink" xmlns:am3d="http://schemas.microsoft.com/office/drawing/2017/model3d" xmlns:o="urn:schemas-microsoft-com:office:office" xmlns:oel="http://schemas.microsoft.com/office/2019/extlst" xmlns:r="http://schemas.openxmlformats.org/officeDocument/2006/relationships" xmlns:m="http://schemas.openxmlformats.org/officeDocument/2006/math" xmlns:v="urn:schemas-microsoft-com:vml" xmlns:wp14="http://schemas.microsoft.com/office/word/2010/wordprocessingDrawing" xmlns:wp="http://schemas.openxmlformats.org/drawingml/2006/wordprocessingDrawing" xmlns:w10="urn:schemas-microsoft-com:office:word" xmlns:w="http://schemas.openxmlformats.org/wordprocessingml/2006/main" xmlns:w14="http://schemas.microsoft.com/office/word/2010/wordml" xmlns:w15="http://schemas.microsoft.com/office/word/2012/wordml" xmlns:w16cex="http://schemas.microsoft.com/office/word/2018/wordml/cex" xmlns:w16cid="http://schemas.microsoft.com/office/word/2016/wordml/cid" xmlns:w16="http://schemas.microsoft.com/office/word/2018/wordml" xmlns:w16du="http://schemas.microsoft.com/office/word/2023/wordml/word16du" xmlns:w16sdtdh="http://schemas.microsoft.com/office/word/2020/wordml/sdtdatahash" xmlns:w16se="http://schemas.microsoft.com/office/word/2015/wordml/symex" xmlns:wpg="http://schemas.microsoft.com/office/word/2010/wordprocessingGroup" xmlns:wpi="http://schemas.microsoft.com/office/word/2010/wordprocessingInk" xmlns:wne="http://schemas.microsoft.com/office/word/2006/wordml" xmlns:wps="http://schemas.microsoft.com/office/word/2010/wordprocessingShape" mc:Ignorable="w14 w15 w16se w16cid w16 w16cex w16sdtdh w16du wp14">
   <w:body>
+    <w:p>
+      <w:pPr>
+        <w:jc w:val="center"/>
+        <w:rPr>
+          <w:b/>
+          <w:bCs/>
+          <w:lang w:val="es-ES"/>
+        </w:rPr>
+      </w:pPr>
+    </w:p>
     <w:p>
       <w:pPr>
         <w:jc w:val="center"/>
@@ -634,9 +644,9 @@
           <w:noProof/>
         </w:rPr>
         <w:drawing>
-          <wp:inline distT="0" distB="0" distL="0" distR="0" wp14:anchorId="741FA079" wp14:editId="2DE41FCF">
-            <wp:extent cx="5400040" cy="3035935"/>
-            <wp:effectExtent l="0" t="0" r="0" b="0"/>
+          <wp:inline distT="0" distB="0" distL="0" distR="0" wp14:anchorId="741FA079" wp14:editId="5C965319">
+            <wp:extent cx="6219825" cy="3496823"/>
+            <wp:effectExtent l="0" t="0" r="0" b="8890"/>
             <wp:docPr id="942170011" name="Imagen 1"/>
             <wp:cNvGraphicFramePr>
               <a:graphicFrameLocks xmlns:a="http://schemas.openxmlformats.org/drawingml/2006/main" noChangeAspect="1"/>
@@ -666,7 +676,7 @@
                   <pic:spPr bwMode="auto">
                     <a:xfrm>
                       <a:off x="0" y="0"/>
-                      <a:ext cx="5400040" cy="3035935"/>
+                      <a:ext cx="6221316" cy="3497661"/>
                     </a:xfrm>
                     <a:prstGeom prst="rect">
                       <a:avLst/>
@@ -713,6 +723,52 @@
         <w:rPr>
           <w:lang w:val="es-ES"/>
         </w:rPr>
+        <w:t>Aclaración</w:t>
+      </w:r>
+      <w:r>
+        <w:rPr>
+          <w:lang w:val="es-ES"/>
+        </w:rPr>
+        <w:t xml:space="preserve"> hoy que me puse a verlo (26/1/2026), como cambiamos los BJT por </w:t>
+      </w:r>
+      <w:proofErr w:type="spellStart"/>
+      <w:r>
+        <w:rPr>
+          <w:lang w:val="es-ES"/>
+        </w:rPr>
+        <w:t>Mosfet</w:t>
+      </w:r>
+      <w:proofErr w:type="spellEnd"/>
+      <w:r>
+        <w:rPr>
+          <w:lang w:val="es-ES"/>
+        </w:rPr>
+        <w:t xml:space="preserve"> tipo P lo que cambiaron fueron los umbrales del Zener, con 3.6 para la seguridad de 5V y </w:t>
+      </w:r>
+      <w:r>
+        <w:rPr>
+          <w:lang w:val="es-ES"/>
+        </w:rPr>
+        <w:t>5.6 para el de 7. Modifique el valor de la resistencia del Zener para distribuir la disipación.</w:t>
+      </w:r>
+    </w:p>
+    <w:p>
+      <w:pPr>
+        <w:rPr>
+          <w:lang w:val="es-ES"/>
+        </w:rPr>
+      </w:pPr>
+    </w:p>
+    <w:p>
+      <w:pPr>
+        <w:rPr>
+          <w:lang w:val="es-ES"/>
+        </w:rPr>
+      </w:pPr>
+      <w:r>
+        <w:rPr>
+          <w:lang w:val="es-ES"/>
+        </w:rPr>
         <w:t xml:space="preserve">Link de Compra: </w:t>
       </w:r>
     </w:p>
@@ -790,7 +846,6 @@
         <w:rPr>
           <w:rStyle w:val="Referenciaintensa"/>
         </w:rPr>
-        <w:lastRenderedPageBreak/>
         <w:t xml:space="preserve">Vamos a hacer ese circuito de </w:t>
       </w:r>
       <w:proofErr w:type="gramStart"/>

</xml_diff>